<commit_message>
Restyle Tables S4, S5, S6 to match main-text three-line rule style
Switched from full-grid to the same three-line style (rule above header,
below header, at foot; no vertical rules) used in Table 1/2
(src/25_tables_1_2.py), for consistency across the appendix.

Also fixed two bugs caught during readback verification while doing this:
- apply_three_line_borders() silently dropped the top rule whenever
  header_row==0 (single-header-row tables): two sequential
  set_cell_borders() calls targeted the same cell, and the second
  (header-bottom) call rebuilt all 6 edges, wiping the first call's top
  edge back to nil. Fixed by combining top+bottom into one call when they
  coincide on the same cell.
- cell.text = "" leaves a stray unformatted empty run ahead of the new
  one in this python-docx version; now stripped before adding the
  formatted run (same fix already applied to Table S1).
</commit_message>
<xml_diff>
--- a/outputs/Table_S5_SampleSize.docx
+++ b/outputs/Table_S5_SampleSize.docx
@@ -23,6 +23,12 @@
         <w:jc w:val="center"/>
         <w:tblLayout w:type="fixed"/>
         <w:tblLook w:firstColumn="1" w:firstRow="1" w:lastColumn="0" w:lastRow="0" w:noHBand="0" w:noVBand="1" w:val="04A0"/>
+        <w:tblCellMar>
+          <w:top w:w="60" w:type="dxa"/>
+          <w:bottom w:w="60" w:type="dxa"/>
+          <w:left w:w="100" w:type="dxa"/>
+          <w:right w:w="100" w:type="dxa"/>
+        </w:tblCellMar>
       </w:tblPr>
       <w:tblGrid>
         <w:gridCol w:w="1474"/>
@@ -42,12 +48,19 @@
         <w:tc>
           <w:tcPr>
             <w:tcW w:type="dxa" w:w="1474"/>
+            <w:tcBorders>
+              <w:top w:val="single" w:sz="18" w:color="000000" w:space="0"/>
+              <w:bottom w:val="single" w:sz="8" w:color="000000" w:space="0"/>
+              <w:left w:val="nil"/>
+              <w:right w:val="nil"/>
+              <w:insideH w:val="nil"/>
+              <w:insideV w:val="nil"/>
+            </w:tcBorders>
           </w:tcPr>
           <w:p>
             <w:pPr>
               <w:jc w:val="center"/>
             </w:pPr>
-            <w:r/>
             <w:r>
               <w:rPr>
                 <w:rFonts w:ascii="Times New Roman" w:hAnsi="Times New Roman" w:cs="Times New Roman" w:eastAsia="Times New Roman"/>
@@ -62,12 +75,19 @@
         <w:tc>
           <w:tcPr>
             <w:tcW w:type="dxa" w:w="907"/>
+            <w:tcBorders>
+              <w:top w:val="single" w:sz="18" w:color="000000" w:space="0"/>
+              <w:bottom w:val="single" w:sz="8" w:color="000000" w:space="0"/>
+              <w:left w:val="nil"/>
+              <w:right w:val="nil"/>
+              <w:insideH w:val="nil"/>
+              <w:insideV w:val="nil"/>
+            </w:tcBorders>
           </w:tcPr>
           <w:p>
             <w:pPr>
               <w:jc w:val="center"/>
             </w:pPr>
-            <w:r/>
             <w:r>
               <w:rPr>
                 <w:rFonts w:ascii="Times New Roman" w:hAnsi="Times New Roman" w:cs="Times New Roman" w:eastAsia="Times New Roman"/>
@@ -82,12 +102,19 @@
         <w:tc>
           <w:tcPr>
             <w:tcW w:type="dxa" w:w="964"/>
+            <w:tcBorders>
+              <w:top w:val="single" w:sz="18" w:color="000000" w:space="0"/>
+              <w:bottom w:val="single" w:sz="8" w:color="000000" w:space="0"/>
+              <w:left w:val="nil"/>
+              <w:right w:val="nil"/>
+              <w:insideH w:val="nil"/>
+              <w:insideV w:val="nil"/>
+            </w:tcBorders>
           </w:tcPr>
           <w:p>
             <w:pPr>
               <w:jc w:val="center"/>
             </w:pPr>
-            <w:r/>
             <w:r>
               <w:rPr>
                 <w:rFonts w:ascii="Times New Roman" w:hAnsi="Times New Roman" w:cs="Times New Roman" w:eastAsia="Times New Roman"/>
@@ -102,12 +129,19 @@
         <w:tc>
           <w:tcPr>
             <w:tcW w:type="dxa" w:w="1191"/>
+            <w:tcBorders>
+              <w:top w:val="single" w:sz="18" w:color="000000" w:space="0"/>
+              <w:bottom w:val="single" w:sz="8" w:color="000000" w:space="0"/>
+              <w:left w:val="nil"/>
+              <w:right w:val="nil"/>
+              <w:insideH w:val="nil"/>
+              <w:insideV w:val="nil"/>
+            </w:tcBorders>
           </w:tcPr>
           <w:p>
             <w:pPr>
               <w:jc w:val="center"/>
             </w:pPr>
-            <w:r/>
             <w:r>
               <w:rPr>
                 <w:rFonts w:ascii="Times New Roman" w:hAnsi="Times New Roman" w:cs="Times New Roman" w:eastAsia="Times New Roman"/>
@@ -124,12 +158,19 @@
         <w:tc>
           <w:tcPr>
             <w:tcW w:type="dxa" w:w="964"/>
+            <w:tcBorders>
+              <w:top w:val="single" w:sz="18" w:color="000000" w:space="0"/>
+              <w:bottom w:val="single" w:sz="8" w:color="000000" w:space="0"/>
+              <w:left w:val="nil"/>
+              <w:right w:val="nil"/>
+              <w:insideH w:val="nil"/>
+              <w:insideV w:val="nil"/>
+            </w:tcBorders>
           </w:tcPr>
           <w:p>
             <w:pPr>
               <w:jc w:val="center"/>
             </w:pPr>
-            <w:r/>
             <w:r>
               <w:rPr>
                 <w:rFonts w:ascii="Times New Roman" w:hAnsi="Times New Roman" w:cs="Times New Roman" w:eastAsia="Times New Roman"/>
@@ -146,12 +187,19 @@
         <w:tc>
           <w:tcPr>
             <w:tcW w:type="dxa" w:w="964"/>
+            <w:tcBorders>
+              <w:top w:val="single" w:sz="18" w:color="000000" w:space="0"/>
+              <w:bottom w:val="single" w:sz="8" w:color="000000" w:space="0"/>
+              <w:left w:val="nil"/>
+              <w:right w:val="nil"/>
+              <w:insideH w:val="nil"/>
+              <w:insideV w:val="nil"/>
+            </w:tcBorders>
           </w:tcPr>
           <w:p>
             <w:pPr>
               <w:jc w:val="center"/>
             </w:pPr>
-            <w:r/>
             <w:r>
               <w:rPr>
                 <w:rFonts w:ascii="Times New Roman" w:hAnsi="Times New Roman" w:cs="Times New Roman" w:eastAsia="Times New Roman"/>
@@ -168,12 +216,19 @@
         <w:tc>
           <w:tcPr>
             <w:tcW w:type="dxa" w:w="1020"/>
+            <w:tcBorders>
+              <w:top w:val="single" w:sz="18" w:color="000000" w:space="0"/>
+              <w:bottom w:val="single" w:sz="8" w:color="000000" w:space="0"/>
+              <w:left w:val="nil"/>
+              <w:right w:val="nil"/>
+              <w:insideH w:val="nil"/>
+              <w:insideV w:val="nil"/>
+            </w:tcBorders>
           </w:tcPr>
           <w:p>
             <w:pPr>
               <w:jc w:val="center"/>
             </w:pPr>
-            <w:r/>
             <w:r>
               <w:rPr>
                 <w:rFonts w:ascii="Times New Roman" w:hAnsi="Times New Roman" w:cs="Times New Roman" w:eastAsia="Times New Roman"/>
@@ -190,12 +245,19 @@
         <w:tc>
           <w:tcPr>
             <w:tcW w:type="dxa" w:w="964"/>
+            <w:tcBorders>
+              <w:top w:val="single" w:sz="18" w:color="000000" w:space="0"/>
+              <w:bottom w:val="single" w:sz="8" w:color="000000" w:space="0"/>
+              <w:left w:val="nil"/>
+              <w:right w:val="nil"/>
+              <w:insideH w:val="nil"/>
+              <w:insideV w:val="nil"/>
+            </w:tcBorders>
           </w:tcPr>
           <w:p>
             <w:pPr>
               <w:jc w:val="center"/>
             </w:pPr>
-            <w:r/>
             <w:r>
               <w:rPr>
                 <w:rFonts w:ascii="Times New Roman" w:hAnsi="Times New Roman" w:cs="Times New Roman" w:eastAsia="Times New Roman"/>
@@ -212,12 +274,19 @@
         <w:tc>
           <w:tcPr>
             <w:tcW w:type="dxa" w:w="964"/>
+            <w:tcBorders>
+              <w:top w:val="single" w:sz="18" w:color="000000" w:space="0"/>
+              <w:bottom w:val="single" w:sz="8" w:color="000000" w:space="0"/>
+              <w:left w:val="nil"/>
+              <w:right w:val="nil"/>
+              <w:insideH w:val="nil"/>
+              <w:insideV w:val="nil"/>
+            </w:tcBorders>
           </w:tcPr>
           <w:p>
             <w:pPr>
               <w:jc w:val="center"/>
             </w:pPr>
-            <w:r/>
             <w:r>
               <w:rPr>
                 <w:rFonts w:ascii="Times New Roman" w:hAnsi="Times New Roman" w:cs="Times New Roman" w:eastAsia="Times New Roman"/>
@@ -234,12 +303,19 @@
         <w:tc>
           <w:tcPr>
             <w:tcW w:type="dxa" w:w="1020"/>
+            <w:tcBorders>
+              <w:top w:val="single" w:sz="18" w:color="000000" w:space="0"/>
+              <w:bottom w:val="single" w:sz="8" w:color="000000" w:space="0"/>
+              <w:left w:val="nil"/>
+              <w:right w:val="nil"/>
+              <w:insideH w:val="nil"/>
+              <w:insideV w:val="nil"/>
+            </w:tcBorders>
           </w:tcPr>
           <w:p>
             <w:pPr>
               <w:jc w:val="center"/>
             </w:pPr>
-            <w:r/>
             <w:r>
               <w:rPr>
                 <w:rFonts w:ascii="Times New Roman" w:hAnsi="Times New Roman" w:cs="Times New Roman" w:eastAsia="Times New Roman"/>
@@ -256,12 +332,19 @@
         <w:tc>
           <w:tcPr>
             <w:tcW w:type="dxa" w:w="964"/>
+            <w:tcBorders>
+              <w:top w:val="single" w:sz="18" w:color="000000" w:space="0"/>
+              <w:bottom w:val="single" w:sz="8" w:color="000000" w:space="0"/>
+              <w:left w:val="nil"/>
+              <w:right w:val="nil"/>
+              <w:insideH w:val="nil"/>
+              <w:insideV w:val="nil"/>
+            </w:tcBorders>
           </w:tcPr>
           <w:p>
             <w:pPr>
               <w:jc w:val="center"/>
             </w:pPr>
-            <w:r/>
             <w:r>
               <w:rPr>
                 <w:rFonts w:ascii="Times New Roman" w:hAnsi="Times New Roman" w:cs="Times New Roman" w:eastAsia="Times New Roman"/>
@@ -278,12 +361,19 @@
         <w:tc>
           <w:tcPr>
             <w:tcW w:type="dxa" w:w="1020"/>
+            <w:tcBorders>
+              <w:top w:val="single" w:sz="18" w:color="000000" w:space="0"/>
+              <w:bottom w:val="single" w:sz="8" w:color="000000" w:space="0"/>
+              <w:left w:val="nil"/>
+              <w:right w:val="nil"/>
+              <w:insideH w:val="nil"/>
+              <w:insideV w:val="nil"/>
+            </w:tcBorders>
           </w:tcPr>
           <w:p>
             <w:pPr>
               <w:jc w:val="center"/>
             </w:pPr>
-            <w:r/>
             <w:r>
               <w:rPr>
                 <w:rFonts w:ascii="Times New Roman" w:hAnsi="Times New Roman" w:cs="Times New Roman" w:eastAsia="Times New Roman"/>
@@ -300,12 +390,19 @@
         <w:tc>
           <w:tcPr>
             <w:tcW w:type="dxa" w:w="1474"/>
+            <w:tcBorders>
+              <w:top w:val="nil"/>
+              <w:bottom w:val="nil"/>
+              <w:left w:val="nil"/>
+              <w:right w:val="nil"/>
+              <w:insideH w:val="nil"/>
+              <w:insideV w:val="nil"/>
+            </w:tcBorders>
           </w:tcPr>
           <w:p>
             <w:pPr>
               <w:jc w:val="left"/>
             </w:pPr>
-            <w:r/>
             <w:r>
               <w:rPr>
                 <w:rFonts w:ascii="Times New Roman" w:hAnsi="Times New Roman" w:cs="Times New Roman" w:eastAsia="Times New Roman"/>
@@ -320,12 +417,19 @@
         <w:tc>
           <w:tcPr>
             <w:tcW w:type="dxa" w:w="907"/>
+            <w:tcBorders>
+              <w:top w:val="nil"/>
+              <w:bottom w:val="nil"/>
+              <w:left w:val="nil"/>
+              <w:right w:val="nil"/>
+              <w:insideH w:val="nil"/>
+              <w:insideV w:val="nil"/>
+            </w:tcBorders>
           </w:tcPr>
           <w:p>
             <w:pPr>
               <w:jc w:val="center"/>
             </w:pPr>
-            <w:r/>
             <w:r>
               <w:rPr>
                 <w:rFonts w:ascii="Times New Roman" w:hAnsi="Times New Roman" w:cs="Times New Roman" w:eastAsia="Times New Roman"/>
@@ -340,12 +444,19 @@
         <w:tc>
           <w:tcPr>
             <w:tcW w:type="dxa" w:w="964"/>
+            <w:tcBorders>
+              <w:top w:val="nil"/>
+              <w:bottom w:val="nil"/>
+              <w:left w:val="nil"/>
+              <w:right w:val="nil"/>
+              <w:insideH w:val="nil"/>
+              <w:insideV w:val="nil"/>
+            </w:tcBorders>
           </w:tcPr>
           <w:p>
             <w:pPr>
               <w:jc w:val="center"/>
             </w:pPr>
-            <w:r/>
             <w:r>
               <w:rPr>
                 <w:rFonts w:ascii="Times New Roman" w:hAnsi="Times New Roman" w:cs="Times New Roman" w:eastAsia="Times New Roman"/>
@@ -360,12 +471,19 @@
         <w:tc>
           <w:tcPr>
             <w:tcW w:type="dxa" w:w="1191"/>
+            <w:tcBorders>
+              <w:top w:val="nil"/>
+              <w:bottom w:val="nil"/>
+              <w:left w:val="nil"/>
+              <w:right w:val="nil"/>
+              <w:insideH w:val="nil"/>
+              <w:insideV w:val="nil"/>
+            </w:tcBorders>
           </w:tcPr>
           <w:p>
             <w:pPr>
               <w:jc w:val="center"/>
             </w:pPr>
-            <w:r/>
             <w:r>
               <w:rPr>
                 <w:rFonts w:ascii="Times New Roman" w:hAnsi="Times New Roman" w:cs="Times New Roman" w:eastAsia="Times New Roman"/>
@@ -380,12 +498,19 @@
         <w:tc>
           <w:tcPr>
             <w:tcW w:type="dxa" w:w="964"/>
+            <w:tcBorders>
+              <w:top w:val="nil"/>
+              <w:bottom w:val="nil"/>
+              <w:left w:val="nil"/>
+              <w:right w:val="nil"/>
+              <w:insideH w:val="nil"/>
+              <w:insideV w:val="nil"/>
+            </w:tcBorders>
           </w:tcPr>
           <w:p>
             <w:pPr>
               <w:jc w:val="center"/>
             </w:pPr>
-            <w:r/>
             <w:r>
               <w:rPr>
                 <w:rFonts w:ascii="Times New Roman" w:hAnsi="Times New Roman" w:cs="Times New Roman" w:eastAsia="Times New Roman"/>
@@ -400,12 +525,19 @@
         <w:tc>
           <w:tcPr>
             <w:tcW w:type="dxa" w:w="964"/>
+            <w:tcBorders>
+              <w:top w:val="nil"/>
+              <w:bottom w:val="nil"/>
+              <w:left w:val="nil"/>
+              <w:right w:val="nil"/>
+              <w:insideH w:val="nil"/>
+              <w:insideV w:val="nil"/>
+            </w:tcBorders>
           </w:tcPr>
           <w:p>
             <w:pPr>
               <w:jc w:val="center"/>
             </w:pPr>
-            <w:r/>
             <w:r>
               <w:rPr>
                 <w:rFonts w:ascii="Times New Roman" w:hAnsi="Times New Roman" w:cs="Times New Roman" w:eastAsia="Times New Roman"/>
@@ -420,12 +552,19 @@
         <w:tc>
           <w:tcPr>
             <w:tcW w:type="dxa" w:w="1020"/>
+            <w:tcBorders>
+              <w:top w:val="nil"/>
+              <w:bottom w:val="nil"/>
+              <w:left w:val="nil"/>
+              <w:right w:val="nil"/>
+              <w:insideH w:val="nil"/>
+              <w:insideV w:val="nil"/>
+            </w:tcBorders>
           </w:tcPr>
           <w:p>
             <w:pPr>
               <w:jc w:val="center"/>
             </w:pPr>
-            <w:r/>
             <w:r>
               <w:rPr>
                 <w:rFonts w:ascii="Times New Roman" w:hAnsi="Times New Roman" w:cs="Times New Roman" w:eastAsia="Times New Roman"/>
@@ -440,12 +579,19 @@
         <w:tc>
           <w:tcPr>
             <w:tcW w:type="dxa" w:w="964"/>
+            <w:tcBorders>
+              <w:top w:val="nil"/>
+              <w:bottom w:val="nil"/>
+              <w:left w:val="nil"/>
+              <w:right w:val="nil"/>
+              <w:insideH w:val="nil"/>
+              <w:insideV w:val="nil"/>
+            </w:tcBorders>
           </w:tcPr>
           <w:p>
             <w:pPr>
               <w:jc w:val="center"/>
             </w:pPr>
-            <w:r/>
             <w:r>
               <w:rPr>
                 <w:rFonts w:ascii="Times New Roman" w:hAnsi="Times New Roman" w:cs="Times New Roman" w:eastAsia="Times New Roman"/>
@@ -460,12 +606,19 @@
         <w:tc>
           <w:tcPr>
             <w:tcW w:type="dxa" w:w="964"/>
+            <w:tcBorders>
+              <w:top w:val="nil"/>
+              <w:bottom w:val="nil"/>
+              <w:left w:val="nil"/>
+              <w:right w:val="nil"/>
+              <w:insideH w:val="nil"/>
+              <w:insideV w:val="nil"/>
+            </w:tcBorders>
           </w:tcPr>
           <w:p>
             <w:pPr>
               <w:jc w:val="center"/>
             </w:pPr>
-            <w:r/>
             <w:r>
               <w:rPr>
                 <w:rFonts w:ascii="Times New Roman" w:hAnsi="Times New Roman" w:cs="Times New Roman" w:eastAsia="Times New Roman"/>
@@ -480,12 +633,19 @@
         <w:tc>
           <w:tcPr>
             <w:tcW w:type="dxa" w:w="1020"/>
+            <w:tcBorders>
+              <w:top w:val="nil"/>
+              <w:bottom w:val="nil"/>
+              <w:left w:val="nil"/>
+              <w:right w:val="nil"/>
+              <w:insideH w:val="nil"/>
+              <w:insideV w:val="nil"/>
+            </w:tcBorders>
           </w:tcPr>
           <w:p>
             <w:pPr>
               <w:jc w:val="center"/>
             </w:pPr>
-            <w:r/>
             <w:r>
               <w:rPr>
                 <w:rFonts w:ascii="Times New Roman" w:hAnsi="Times New Roman" w:cs="Times New Roman" w:eastAsia="Times New Roman"/>
@@ -500,12 +660,19 @@
         <w:tc>
           <w:tcPr>
             <w:tcW w:type="dxa" w:w="964"/>
+            <w:tcBorders>
+              <w:top w:val="nil"/>
+              <w:bottom w:val="nil"/>
+              <w:left w:val="nil"/>
+              <w:right w:val="nil"/>
+              <w:insideH w:val="nil"/>
+              <w:insideV w:val="nil"/>
+            </w:tcBorders>
           </w:tcPr>
           <w:p>
             <w:pPr>
               <w:jc w:val="center"/>
             </w:pPr>
-            <w:r/>
             <w:r>
               <w:rPr>
                 <w:rFonts w:ascii="Times New Roman" w:hAnsi="Times New Roman" w:cs="Times New Roman" w:eastAsia="Times New Roman"/>
@@ -520,12 +687,19 @@
         <w:tc>
           <w:tcPr>
             <w:tcW w:type="dxa" w:w="1020"/>
+            <w:tcBorders>
+              <w:top w:val="nil"/>
+              <w:bottom w:val="nil"/>
+              <w:left w:val="nil"/>
+              <w:right w:val="nil"/>
+              <w:insideH w:val="nil"/>
+              <w:insideV w:val="nil"/>
+            </w:tcBorders>
           </w:tcPr>
           <w:p>
             <w:pPr>
               <w:jc w:val="center"/>
             </w:pPr>
-            <w:r/>
             <w:r>
               <w:rPr>
                 <w:rFonts w:ascii="Times New Roman" w:hAnsi="Times New Roman" w:cs="Times New Roman" w:eastAsia="Times New Roman"/>
@@ -542,12 +716,19 @@
         <w:tc>
           <w:tcPr>
             <w:tcW w:type="dxa" w:w="1474"/>
+            <w:tcBorders>
+              <w:top w:val="nil"/>
+              <w:bottom w:val="nil"/>
+              <w:left w:val="nil"/>
+              <w:right w:val="nil"/>
+              <w:insideH w:val="nil"/>
+              <w:insideV w:val="nil"/>
+            </w:tcBorders>
           </w:tcPr>
           <w:p>
             <w:pPr>
               <w:jc w:val="left"/>
             </w:pPr>
-            <w:r/>
             <w:r>
               <w:rPr>
                 <w:rFonts w:ascii="Times New Roman" w:hAnsi="Times New Roman" w:cs="Times New Roman" w:eastAsia="Times New Roman"/>
@@ -562,12 +743,19 @@
         <w:tc>
           <w:tcPr>
             <w:tcW w:type="dxa" w:w="907"/>
+            <w:tcBorders>
+              <w:top w:val="nil"/>
+              <w:bottom w:val="nil"/>
+              <w:left w:val="nil"/>
+              <w:right w:val="nil"/>
+              <w:insideH w:val="nil"/>
+              <w:insideV w:val="nil"/>
+            </w:tcBorders>
           </w:tcPr>
           <w:p>
             <w:pPr>
               <w:jc w:val="center"/>
             </w:pPr>
-            <w:r/>
             <w:r>
               <w:rPr>
                 <w:rFonts w:ascii="Times New Roman" w:hAnsi="Times New Roman" w:cs="Times New Roman" w:eastAsia="Times New Roman"/>
@@ -582,12 +770,19 @@
         <w:tc>
           <w:tcPr>
             <w:tcW w:type="dxa" w:w="964"/>
+            <w:tcBorders>
+              <w:top w:val="nil"/>
+              <w:bottom w:val="nil"/>
+              <w:left w:val="nil"/>
+              <w:right w:val="nil"/>
+              <w:insideH w:val="nil"/>
+              <w:insideV w:val="nil"/>
+            </w:tcBorders>
           </w:tcPr>
           <w:p>
             <w:pPr>
               <w:jc w:val="center"/>
             </w:pPr>
-            <w:r/>
             <w:r>
               <w:rPr>
                 <w:rFonts w:ascii="Times New Roman" w:hAnsi="Times New Roman" w:cs="Times New Roman" w:eastAsia="Times New Roman"/>
@@ -602,12 +797,19 @@
         <w:tc>
           <w:tcPr>
             <w:tcW w:type="dxa" w:w="1191"/>
+            <w:tcBorders>
+              <w:top w:val="nil"/>
+              <w:bottom w:val="nil"/>
+              <w:left w:val="nil"/>
+              <w:right w:val="nil"/>
+              <w:insideH w:val="nil"/>
+              <w:insideV w:val="nil"/>
+            </w:tcBorders>
           </w:tcPr>
           <w:p>
             <w:pPr>
               <w:jc w:val="center"/>
             </w:pPr>
-            <w:r/>
             <w:r>
               <w:rPr>
                 <w:rFonts w:ascii="Times New Roman" w:hAnsi="Times New Roman" w:cs="Times New Roman" w:eastAsia="Times New Roman"/>
@@ -622,12 +824,19 @@
         <w:tc>
           <w:tcPr>
             <w:tcW w:type="dxa" w:w="964"/>
+            <w:tcBorders>
+              <w:top w:val="nil"/>
+              <w:bottom w:val="nil"/>
+              <w:left w:val="nil"/>
+              <w:right w:val="nil"/>
+              <w:insideH w:val="nil"/>
+              <w:insideV w:val="nil"/>
+            </w:tcBorders>
           </w:tcPr>
           <w:p>
             <w:pPr>
               <w:jc w:val="center"/>
             </w:pPr>
-            <w:r/>
             <w:r>
               <w:rPr>
                 <w:rFonts w:ascii="Times New Roman" w:hAnsi="Times New Roman" w:cs="Times New Roman" w:eastAsia="Times New Roman"/>
@@ -642,12 +851,19 @@
         <w:tc>
           <w:tcPr>
             <w:tcW w:type="dxa" w:w="964"/>
+            <w:tcBorders>
+              <w:top w:val="nil"/>
+              <w:bottom w:val="nil"/>
+              <w:left w:val="nil"/>
+              <w:right w:val="nil"/>
+              <w:insideH w:val="nil"/>
+              <w:insideV w:val="nil"/>
+            </w:tcBorders>
           </w:tcPr>
           <w:p>
             <w:pPr>
               <w:jc w:val="center"/>
             </w:pPr>
-            <w:r/>
             <w:r>
               <w:rPr>
                 <w:rFonts w:ascii="Times New Roman" w:hAnsi="Times New Roman" w:cs="Times New Roman" w:eastAsia="Times New Roman"/>
@@ -662,12 +878,19 @@
         <w:tc>
           <w:tcPr>
             <w:tcW w:type="dxa" w:w="1020"/>
+            <w:tcBorders>
+              <w:top w:val="nil"/>
+              <w:bottom w:val="nil"/>
+              <w:left w:val="nil"/>
+              <w:right w:val="nil"/>
+              <w:insideH w:val="nil"/>
+              <w:insideV w:val="nil"/>
+            </w:tcBorders>
           </w:tcPr>
           <w:p>
             <w:pPr>
               <w:jc w:val="center"/>
             </w:pPr>
-            <w:r/>
             <w:r>
               <w:rPr>
                 <w:rFonts w:ascii="Times New Roman" w:hAnsi="Times New Roman" w:cs="Times New Roman" w:eastAsia="Times New Roman"/>
@@ -682,12 +905,19 @@
         <w:tc>
           <w:tcPr>
             <w:tcW w:type="dxa" w:w="964"/>
+            <w:tcBorders>
+              <w:top w:val="nil"/>
+              <w:bottom w:val="nil"/>
+              <w:left w:val="nil"/>
+              <w:right w:val="nil"/>
+              <w:insideH w:val="nil"/>
+              <w:insideV w:val="nil"/>
+            </w:tcBorders>
           </w:tcPr>
           <w:p>
             <w:pPr>
               <w:jc w:val="center"/>
             </w:pPr>
-            <w:r/>
             <w:r>
               <w:rPr>
                 <w:rFonts w:ascii="Times New Roman" w:hAnsi="Times New Roman" w:cs="Times New Roman" w:eastAsia="Times New Roman"/>
@@ -702,12 +932,19 @@
         <w:tc>
           <w:tcPr>
             <w:tcW w:type="dxa" w:w="964"/>
+            <w:tcBorders>
+              <w:top w:val="nil"/>
+              <w:bottom w:val="nil"/>
+              <w:left w:val="nil"/>
+              <w:right w:val="nil"/>
+              <w:insideH w:val="nil"/>
+              <w:insideV w:val="nil"/>
+            </w:tcBorders>
           </w:tcPr>
           <w:p>
             <w:pPr>
               <w:jc w:val="center"/>
             </w:pPr>
-            <w:r/>
             <w:r>
               <w:rPr>
                 <w:rFonts w:ascii="Times New Roman" w:hAnsi="Times New Roman" w:cs="Times New Roman" w:eastAsia="Times New Roman"/>
@@ -722,12 +959,19 @@
         <w:tc>
           <w:tcPr>
             <w:tcW w:type="dxa" w:w="1020"/>
+            <w:tcBorders>
+              <w:top w:val="nil"/>
+              <w:bottom w:val="nil"/>
+              <w:left w:val="nil"/>
+              <w:right w:val="nil"/>
+              <w:insideH w:val="nil"/>
+              <w:insideV w:val="nil"/>
+            </w:tcBorders>
           </w:tcPr>
           <w:p>
             <w:pPr>
               <w:jc w:val="center"/>
             </w:pPr>
-            <w:r/>
             <w:r>
               <w:rPr>
                 <w:rFonts w:ascii="Times New Roman" w:hAnsi="Times New Roman" w:cs="Times New Roman" w:eastAsia="Times New Roman"/>
@@ -742,12 +986,19 @@
         <w:tc>
           <w:tcPr>
             <w:tcW w:type="dxa" w:w="964"/>
+            <w:tcBorders>
+              <w:top w:val="nil"/>
+              <w:bottom w:val="nil"/>
+              <w:left w:val="nil"/>
+              <w:right w:val="nil"/>
+              <w:insideH w:val="nil"/>
+              <w:insideV w:val="nil"/>
+            </w:tcBorders>
           </w:tcPr>
           <w:p>
             <w:pPr>
               <w:jc w:val="center"/>
             </w:pPr>
-            <w:r/>
             <w:r>
               <w:rPr>
                 <w:rFonts w:ascii="Times New Roman" w:hAnsi="Times New Roman" w:cs="Times New Roman" w:eastAsia="Times New Roman"/>
@@ -762,12 +1013,19 @@
         <w:tc>
           <w:tcPr>
             <w:tcW w:type="dxa" w:w="1020"/>
+            <w:tcBorders>
+              <w:top w:val="nil"/>
+              <w:bottom w:val="nil"/>
+              <w:left w:val="nil"/>
+              <w:right w:val="nil"/>
+              <w:insideH w:val="nil"/>
+              <w:insideV w:val="nil"/>
+            </w:tcBorders>
           </w:tcPr>
           <w:p>
             <w:pPr>
               <w:jc w:val="center"/>
             </w:pPr>
-            <w:r/>
             <w:r>
               <w:rPr>
                 <w:rFonts w:ascii="Times New Roman" w:hAnsi="Times New Roman" w:cs="Times New Roman" w:eastAsia="Times New Roman"/>
@@ -784,12 +1042,19 @@
         <w:tc>
           <w:tcPr>
             <w:tcW w:type="dxa" w:w="1474"/>
+            <w:tcBorders>
+              <w:top w:val="nil"/>
+              <w:bottom w:val="nil"/>
+              <w:left w:val="nil"/>
+              <w:right w:val="nil"/>
+              <w:insideH w:val="nil"/>
+              <w:insideV w:val="nil"/>
+            </w:tcBorders>
           </w:tcPr>
           <w:p>
             <w:pPr>
               <w:jc w:val="left"/>
             </w:pPr>
-            <w:r/>
             <w:r>
               <w:rPr>
                 <w:rFonts w:ascii="Times New Roman" w:hAnsi="Times New Roman" w:cs="Times New Roman" w:eastAsia="Times New Roman"/>
@@ -804,12 +1069,19 @@
         <w:tc>
           <w:tcPr>
             <w:tcW w:type="dxa" w:w="907"/>
+            <w:tcBorders>
+              <w:top w:val="nil"/>
+              <w:bottom w:val="nil"/>
+              <w:left w:val="nil"/>
+              <w:right w:val="nil"/>
+              <w:insideH w:val="nil"/>
+              <w:insideV w:val="nil"/>
+            </w:tcBorders>
           </w:tcPr>
           <w:p>
             <w:pPr>
               <w:jc w:val="center"/>
             </w:pPr>
-            <w:r/>
             <w:r>
               <w:rPr>
                 <w:rFonts w:ascii="Times New Roman" w:hAnsi="Times New Roman" w:cs="Times New Roman" w:eastAsia="Times New Roman"/>
@@ -824,12 +1096,19 @@
         <w:tc>
           <w:tcPr>
             <w:tcW w:type="dxa" w:w="964"/>
+            <w:tcBorders>
+              <w:top w:val="nil"/>
+              <w:bottom w:val="nil"/>
+              <w:left w:val="nil"/>
+              <w:right w:val="nil"/>
+              <w:insideH w:val="nil"/>
+              <w:insideV w:val="nil"/>
+            </w:tcBorders>
           </w:tcPr>
           <w:p>
             <w:pPr>
               <w:jc w:val="center"/>
             </w:pPr>
-            <w:r/>
             <w:r>
               <w:rPr>
                 <w:rFonts w:ascii="Times New Roman" w:hAnsi="Times New Roman" w:cs="Times New Roman" w:eastAsia="Times New Roman"/>
@@ -844,12 +1123,19 @@
         <w:tc>
           <w:tcPr>
             <w:tcW w:type="dxa" w:w="1191"/>
+            <w:tcBorders>
+              <w:top w:val="nil"/>
+              <w:bottom w:val="nil"/>
+              <w:left w:val="nil"/>
+              <w:right w:val="nil"/>
+              <w:insideH w:val="nil"/>
+              <w:insideV w:val="nil"/>
+            </w:tcBorders>
           </w:tcPr>
           <w:p>
             <w:pPr>
               <w:jc w:val="center"/>
             </w:pPr>
-            <w:r/>
             <w:r>
               <w:rPr>
                 <w:rFonts w:ascii="Times New Roman" w:hAnsi="Times New Roman" w:cs="Times New Roman" w:eastAsia="Times New Roman"/>
@@ -864,12 +1150,19 @@
         <w:tc>
           <w:tcPr>
             <w:tcW w:type="dxa" w:w="964"/>
+            <w:tcBorders>
+              <w:top w:val="nil"/>
+              <w:bottom w:val="nil"/>
+              <w:left w:val="nil"/>
+              <w:right w:val="nil"/>
+              <w:insideH w:val="nil"/>
+              <w:insideV w:val="nil"/>
+            </w:tcBorders>
           </w:tcPr>
           <w:p>
             <w:pPr>
               <w:jc w:val="center"/>
             </w:pPr>
-            <w:r/>
             <w:r>
               <w:rPr>
                 <w:rFonts w:ascii="Times New Roman" w:hAnsi="Times New Roman" w:cs="Times New Roman" w:eastAsia="Times New Roman"/>
@@ -884,12 +1177,19 @@
         <w:tc>
           <w:tcPr>
             <w:tcW w:type="dxa" w:w="964"/>
+            <w:tcBorders>
+              <w:top w:val="nil"/>
+              <w:bottom w:val="nil"/>
+              <w:left w:val="nil"/>
+              <w:right w:val="nil"/>
+              <w:insideH w:val="nil"/>
+              <w:insideV w:val="nil"/>
+            </w:tcBorders>
           </w:tcPr>
           <w:p>
             <w:pPr>
               <w:jc w:val="center"/>
             </w:pPr>
-            <w:r/>
             <w:r>
               <w:rPr>
                 <w:rFonts w:ascii="Times New Roman" w:hAnsi="Times New Roman" w:cs="Times New Roman" w:eastAsia="Times New Roman"/>
@@ -904,12 +1204,19 @@
         <w:tc>
           <w:tcPr>
             <w:tcW w:type="dxa" w:w="1020"/>
+            <w:tcBorders>
+              <w:top w:val="nil"/>
+              <w:bottom w:val="nil"/>
+              <w:left w:val="nil"/>
+              <w:right w:val="nil"/>
+              <w:insideH w:val="nil"/>
+              <w:insideV w:val="nil"/>
+            </w:tcBorders>
           </w:tcPr>
           <w:p>
             <w:pPr>
               <w:jc w:val="center"/>
             </w:pPr>
-            <w:r/>
             <w:r>
               <w:rPr>
                 <w:rFonts w:ascii="Times New Roman" w:hAnsi="Times New Roman" w:cs="Times New Roman" w:eastAsia="Times New Roman"/>
@@ -924,12 +1231,19 @@
         <w:tc>
           <w:tcPr>
             <w:tcW w:type="dxa" w:w="964"/>
+            <w:tcBorders>
+              <w:top w:val="nil"/>
+              <w:bottom w:val="nil"/>
+              <w:left w:val="nil"/>
+              <w:right w:val="nil"/>
+              <w:insideH w:val="nil"/>
+              <w:insideV w:val="nil"/>
+            </w:tcBorders>
           </w:tcPr>
           <w:p>
             <w:pPr>
               <w:jc w:val="center"/>
             </w:pPr>
-            <w:r/>
             <w:r>
               <w:rPr>
                 <w:rFonts w:ascii="Times New Roman" w:hAnsi="Times New Roman" w:cs="Times New Roman" w:eastAsia="Times New Roman"/>
@@ -944,12 +1258,19 @@
         <w:tc>
           <w:tcPr>
             <w:tcW w:type="dxa" w:w="964"/>
+            <w:tcBorders>
+              <w:top w:val="nil"/>
+              <w:bottom w:val="nil"/>
+              <w:left w:val="nil"/>
+              <w:right w:val="nil"/>
+              <w:insideH w:val="nil"/>
+              <w:insideV w:val="nil"/>
+            </w:tcBorders>
           </w:tcPr>
           <w:p>
             <w:pPr>
               <w:jc w:val="center"/>
             </w:pPr>
-            <w:r/>
             <w:r>
               <w:rPr>
                 <w:rFonts w:ascii="Times New Roman" w:hAnsi="Times New Roman" w:cs="Times New Roman" w:eastAsia="Times New Roman"/>
@@ -964,12 +1285,19 @@
         <w:tc>
           <w:tcPr>
             <w:tcW w:type="dxa" w:w="1020"/>
+            <w:tcBorders>
+              <w:top w:val="nil"/>
+              <w:bottom w:val="nil"/>
+              <w:left w:val="nil"/>
+              <w:right w:val="nil"/>
+              <w:insideH w:val="nil"/>
+              <w:insideV w:val="nil"/>
+            </w:tcBorders>
           </w:tcPr>
           <w:p>
             <w:pPr>
               <w:jc w:val="center"/>
             </w:pPr>
-            <w:r/>
             <w:r>
               <w:rPr>
                 <w:rFonts w:ascii="Times New Roman" w:hAnsi="Times New Roman" w:cs="Times New Roman" w:eastAsia="Times New Roman"/>
@@ -984,12 +1312,19 @@
         <w:tc>
           <w:tcPr>
             <w:tcW w:type="dxa" w:w="964"/>
+            <w:tcBorders>
+              <w:top w:val="nil"/>
+              <w:bottom w:val="nil"/>
+              <w:left w:val="nil"/>
+              <w:right w:val="nil"/>
+              <w:insideH w:val="nil"/>
+              <w:insideV w:val="nil"/>
+            </w:tcBorders>
           </w:tcPr>
           <w:p>
             <w:pPr>
               <w:jc w:val="center"/>
             </w:pPr>
-            <w:r/>
             <w:r>
               <w:rPr>
                 <w:rFonts w:ascii="Times New Roman" w:hAnsi="Times New Roman" w:cs="Times New Roman" w:eastAsia="Times New Roman"/>
@@ -1004,12 +1339,19 @@
         <w:tc>
           <w:tcPr>
             <w:tcW w:type="dxa" w:w="1020"/>
+            <w:tcBorders>
+              <w:top w:val="nil"/>
+              <w:bottom w:val="nil"/>
+              <w:left w:val="nil"/>
+              <w:right w:val="nil"/>
+              <w:insideH w:val="nil"/>
+              <w:insideV w:val="nil"/>
+            </w:tcBorders>
           </w:tcPr>
           <w:p>
             <w:pPr>
               <w:jc w:val="center"/>
             </w:pPr>
-            <w:r/>
             <w:r>
               <w:rPr>
                 <w:rFonts w:ascii="Times New Roman" w:hAnsi="Times New Roman" w:cs="Times New Roman" w:eastAsia="Times New Roman"/>
@@ -1026,12 +1368,19 @@
         <w:tc>
           <w:tcPr>
             <w:tcW w:type="dxa" w:w="1474"/>
+            <w:tcBorders>
+              <w:top w:val="nil"/>
+              <w:bottom w:val="nil"/>
+              <w:left w:val="nil"/>
+              <w:right w:val="nil"/>
+              <w:insideH w:val="nil"/>
+              <w:insideV w:val="nil"/>
+            </w:tcBorders>
           </w:tcPr>
           <w:p>
             <w:pPr>
               <w:jc w:val="left"/>
             </w:pPr>
-            <w:r/>
             <w:r>
               <w:rPr>
                 <w:rFonts w:ascii="Times New Roman" w:hAnsi="Times New Roman" w:cs="Times New Roman" w:eastAsia="Times New Roman"/>
@@ -1046,12 +1395,19 @@
         <w:tc>
           <w:tcPr>
             <w:tcW w:type="dxa" w:w="907"/>
+            <w:tcBorders>
+              <w:top w:val="nil"/>
+              <w:bottom w:val="nil"/>
+              <w:left w:val="nil"/>
+              <w:right w:val="nil"/>
+              <w:insideH w:val="nil"/>
+              <w:insideV w:val="nil"/>
+            </w:tcBorders>
           </w:tcPr>
           <w:p>
             <w:pPr>
               <w:jc w:val="center"/>
             </w:pPr>
-            <w:r/>
             <w:r>
               <w:rPr>
                 <w:rFonts w:ascii="Times New Roman" w:hAnsi="Times New Roman" w:cs="Times New Roman" w:eastAsia="Times New Roman"/>
@@ -1066,12 +1422,19 @@
         <w:tc>
           <w:tcPr>
             <w:tcW w:type="dxa" w:w="964"/>
+            <w:tcBorders>
+              <w:top w:val="nil"/>
+              <w:bottom w:val="nil"/>
+              <w:left w:val="nil"/>
+              <w:right w:val="nil"/>
+              <w:insideH w:val="nil"/>
+              <w:insideV w:val="nil"/>
+            </w:tcBorders>
           </w:tcPr>
           <w:p>
             <w:pPr>
               <w:jc w:val="center"/>
             </w:pPr>
-            <w:r/>
             <w:r>
               <w:rPr>
                 <w:rFonts w:ascii="Times New Roman" w:hAnsi="Times New Roman" w:cs="Times New Roman" w:eastAsia="Times New Roman"/>
@@ -1086,12 +1449,19 @@
         <w:tc>
           <w:tcPr>
             <w:tcW w:type="dxa" w:w="1191"/>
+            <w:tcBorders>
+              <w:top w:val="nil"/>
+              <w:bottom w:val="nil"/>
+              <w:left w:val="nil"/>
+              <w:right w:val="nil"/>
+              <w:insideH w:val="nil"/>
+              <w:insideV w:val="nil"/>
+            </w:tcBorders>
           </w:tcPr>
           <w:p>
             <w:pPr>
               <w:jc w:val="center"/>
             </w:pPr>
-            <w:r/>
             <w:r>
               <w:rPr>
                 <w:rFonts w:ascii="Times New Roman" w:hAnsi="Times New Roman" w:cs="Times New Roman" w:eastAsia="Times New Roman"/>
@@ -1106,12 +1476,19 @@
         <w:tc>
           <w:tcPr>
             <w:tcW w:type="dxa" w:w="964"/>
+            <w:tcBorders>
+              <w:top w:val="nil"/>
+              <w:bottom w:val="nil"/>
+              <w:left w:val="nil"/>
+              <w:right w:val="nil"/>
+              <w:insideH w:val="nil"/>
+              <w:insideV w:val="nil"/>
+            </w:tcBorders>
           </w:tcPr>
           <w:p>
             <w:pPr>
               <w:jc w:val="center"/>
             </w:pPr>
-            <w:r/>
             <w:r>
               <w:rPr>
                 <w:rFonts w:ascii="Times New Roman" w:hAnsi="Times New Roman" w:cs="Times New Roman" w:eastAsia="Times New Roman"/>
@@ -1126,12 +1503,19 @@
         <w:tc>
           <w:tcPr>
             <w:tcW w:type="dxa" w:w="964"/>
+            <w:tcBorders>
+              <w:top w:val="nil"/>
+              <w:bottom w:val="nil"/>
+              <w:left w:val="nil"/>
+              <w:right w:val="nil"/>
+              <w:insideH w:val="nil"/>
+              <w:insideV w:val="nil"/>
+            </w:tcBorders>
           </w:tcPr>
           <w:p>
             <w:pPr>
               <w:jc w:val="center"/>
             </w:pPr>
-            <w:r/>
             <w:r>
               <w:rPr>
                 <w:rFonts w:ascii="Times New Roman" w:hAnsi="Times New Roman" w:cs="Times New Roman" w:eastAsia="Times New Roman"/>
@@ -1146,12 +1530,19 @@
         <w:tc>
           <w:tcPr>
             <w:tcW w:type="dxa" w:w="1020"/>
+            <w:tcBorders>
+              <w:top w:val="nil"/>
+              <w:bottom w:val="nil"/>
+              <w:left w:val="nil"/>
+              <w:right w:val="nil"/>
+              <w:insideH w:val="nil"/>
+              <w:insideV w:val="nil"/>
+            </w:tcBorders>
           </w:tcPr>
           <w:p>
             <w:pPr>
               <w:jc w:val="center"/>
             </w:pPr>
-            <w:r/>
             <w:r>
               <w:rPr>
                 <w:rFonts w:ascii="Times New Roman" w:hAnsi="Times New Roman" w:cs="Times New Roman" w:eastAsia="Times New Roman"/>
@@ -1166,12 +1557,19 @@
         <w:tc>
           <w:tcPr>
             <w:tcW w:type="dxa" w:w="964"/>
+            <w:tcBorders>
+              <w:top w:val="nil"/>
+              <w:bottom w:val="nil"/>
+              <w:left w:val="nil"/>
+              <w:right w:val="nil"/>
+              <w:insideH w:val="nil"/>
+              <w:insideV w:val="nil"/>
+            </w:tcBorders>
           </w:tcPr>
           <w:p>
             <w:pPr>
               <w:jc w:val="center"/>
             </w:pPr>
-            <w:r/>
             <w:r>
               <w:rPr>
                 <w:rFonts w:ascii="Times New Roman" w:hAnsi="Times New Roman" w:cs="Times New Roman" w:eastAsia="Times New Roman"/>
@@ -1186,12 +1584,19 @@
         <w:tc>
           <w:tcPr>
             <w:tcW w:type="dxa" w:w="964"/>
+            <w:tcBorders>
+              <w:top w:val="nil"/>
+              <w:bottom w:val="nil"/>
+              <w:left w:val="nil"/>
+              <w:right w:val="nil"/>
+              <w:insideH w:val="nil"/>
+              <w:insideV w:val="nil"/>
+            </w:tcBorders>
           </w:tcPr>
           <w:p>
             <w:pPr>
               <w:jc w:val="center"/>
             </w:pPr>
-            <w:r/>
             <w:r>
               <w:rPr>
                 <w:rFonts w:ascii="Times New Roman" w:hAnsi="Times New Roman" w:cs="Times New Roman" w:eastAsia="Times New Roman"/>
@@ -1206,12 +1611,19 @@
         <w:tc>
           <w:tcPr>
             <w:tcW w:type="dxa" w:w="1020"/>
+            <w:tcBorders>
+              <w:top w:val="nil"/>
+              <w:bottom w:val="nil"/>
+              <w:left w:val="nil"/>
+              <w:right w:val="nil"/>
+              <w:insideH w:val="nil"/>
+              <w:insideV w:val="nil"/>
+            </w:tcBorders>
           </w:tcPr>
           <w:p>
             <w:pPr>
               <w:jc w:val="center"/>
             </w:pPr>
-            <w:r/>
             <w:r>
               <w:rPr>
                 <w:rFonts w:ascii="Times New Roman" w:hAnsi="Times New Roman" w:cs="Times New Roman" w:eastAsia="Times New Roman"/>
@@ -1226,12 +1638,19 @@
         <w:tc>
           <w:tcPr>
             <w:tcW w:type="dxa" w:w="964"/>
+            <w:tcBorders>
+              <w:top w:val="nil"/>
+              <w:bottom w:val="nil"/>
+              <w:left w:val="nil"/>
+              <w:right w:val="nil"/>
+              <w:insideH w:val="nil"/>
+              <w:insideV w:val="nil"/>
+            </w:tcBorders>
           </w:tcPr>
           <w:p>
             <w:pPr>
               <w:jc w:val="center"/>
             </w:pPr>
-            <w:r/>
             <w:r>
               <w:rPr>
                 <w:rFonts w:ascii="Times New Roman" w:hAnsi="Times New Roman" w:cs="Times New Roman" w:eastAsia="Times New Roman"/>
@@ -1246,12 +1665,19 @@
         <w:tc>
           <w:tcPr>
             <w:tcW w:type="dxa" w:w="1020"/>
+            <w:tcBorders>
+              <w:top w:val="nil"/>
+              <w:bottom w:val="nil"/>
+              <w:left w:val="nil"/>
+              <w:right w:val="nil"/>
+              <w:insideH w:val="nil"/>
+              <w:insideV w:val="nil"/>
+            </w:tcBorders>
           </w:tcPr>
           <w:p>
             <w:pPr>
               <w:jc w:val="center"/>
             </w:pPr>
-            <w:r/>
             <w:r>
               <w:rPr>
                 <w:rFonts w:ascii="Times New Roman" w:hAnsi="Times New Roman" w:cs="Times New Roman" w:eastAsia="Times New Roman"/>
@@ -1268,12 +1694,19 @@
         <w:tc>
           <w:tcPr>
             <w:tcW w:type="dxa" w:w="1474"/>
+            <w:tcBorders>
+              <w:top w:val="nil"/>
+              <w:bottom w:val="single" w:sz="18" w:color="000000" w:space="0"/>
+              <w:left w:val="nil"/>
+              <w:right w:val="nil"/>
+              <w:insideH w:val="nil"/>
+              <w:insideV w:val="nil"/>
+            </w:tcBorders>
           </w:tcPr>
           <w:p>
             <w:pPr>
               <w:jc w:val="left"/>
             </w:pPr>
-            <w:r/>
             <w:r>
               <w:rPr>
                 <w:rFonts w:ascii="Times New Roman" w:hAnsi="Times New Roman" w:cs="Times New Roman" w:eastAsia="Times New Roman"/>
@@ -1288,12 +1721,19 @@
         <w:tc>
           <w:tcPr>
             <w:tcW w:type="dxa" w:w="907"/>
+            <w:tcBorders>
+              <w:top w:val="nil"/>
+              <w:bottom w:val="single" w:sz="18" w:color="000000" w:space="0"/>
+              <w:left w:val="nil"/>
+              <w:right w:val="nil"/>
+              <w:insideH w:val="nil"/>
+              <w:insideV w:val="nil"/>
+            </w:tcBorders>
           </w:tcPr>
           <w:p>
             <w:pPr>
               <w:jc w:val="center"/>
             </w:pPr>
-            <w:r/>
             <w:r>
               <w:rPr>
                 <w:rFonts w:ascii="Times New Roman" w:hAnsi="Times New Roman" w:cs="Times New Roman" w:eastAsia="Times New Roman"/>
@@ -1308,12 +1748,19 @@
         <w:tc>
           <w:tcPr>
             <w:tcW w:type="dxa" w:w="964"/>
+            <w:tcBorders>
+              <w:top w:val="nil"/>
+              <w:bottom w:val="single" w:sz="18" w:color="000000" w:space="0"/>
+              <w:left w:val="nil"/>
+              <w:right w:val="nil"/>
+              <w:insideH w:val="nil"/>
+              <w:insideV w:val="nil"/>
+            </w:tcBorders>
           </w:tcPr>
           <w:p>
             <w:pPr>
               <w:jc w:val="center"/>
             </w:pPr>
-            <w:r/>
             <w:r>
               <w:rPr>
                 <w:rFonts w:ascii="Times New Roman" w:hAnsi="Times New Roman" w:cs="Times New Roman" w:eastAsia="Times New Roman"/>
@@ -1328,12 +1775,19 @@
         <w:tc>
           <w:tcPr>
             <w:tcW w:type="dxa" w:w="1191"/>
+            <w:tcBorders>
+              <w:top w:val="nil"/>
+              <w:bottom w:val="single" w:sz="18" w:color="000000" w:space="0"/>
+              <w:left w:val="nil"/>
+              <w:right w:val="nil"/>
+              <w:insideH w:val="nil"/>
+              <w:insideV w:val="nil"/>
+            </w:tcBorders>
           </w:tcPr>
           <w:p>
             <w:pPr>
               <w:jc w:val="center"/>
             </w:pPr>
-            <w:r/>
             <w:r>
               <w:rPr>
                 <w:rFonts w:ascii="Times New Roman" w:hAnsi="Times New Roman" w:cs="Times New Roman" w:eastAsia="Times New Roman"/>
@@ -1348,12 +1802,19 @@
         <w:tc>
           <w:tcPr>
             <w:tcW w:type="dxa" w:w="964"/>
+            <w:tcBorders>
+              <w:top w:val="nil"/>
+              <w:bottom w:val="single" w:sz="18" w:color="000000" w:space="0"/>
+              <w:left w:val="nil"/>
+              <w:right w:val="nil"/>
+              <w:insideH w:val="nil"/>
+              <w:insideV w:val="nil"/>
+            </w:tcBorders>
           </w:tcPr>
           <w:p>
             <w:pPr>
               <w:jc w:val="center"/>
             </w:pPr>
-            <w:r/>
             <w:r>
               <w:rPr>
                 <w:rFonts w:ascii="Times New Roman" w:hAnsi="Times New Roman" w:cs="Times New Roman" w:eastAsia="Times New Roman"/>
@@ -1368,12 +1829,19 @@
         <w:tc>
           <w:tcPr>
             <w:tcW w:type="dxa" w:w="964"/>
+            <w:tcBorders>
+              <w:top w:val="nil"/>
+              <w:bottom w:val="single" w:sz="18" w:color="000000" w:space="0"/>
+              <w:left w:val="nil"/>
+              <w:right w:val="nil"/>
+              <w:insideH w:val="nil"/>
+              <w:insideV w:val="nil"/>
+            </w:tcBorders>
           </w:tcPr>
           <w:p>
             <w:pPr>
               <w:jc w:val="center"/>
             </w:pPr>
-            <w:r/>
             <w:r>
               <w:rPr>
                 <w:rFonts w:ascii="Times New Roman" w:hAnsi="Times New Roman" w:cs="Times New Roman" w:eastAsia="Times New Roman"/>
@@ -1388,12 +1856,19 @@
         <w:tc>
           <w:tcPr>
             <w:tcW w:type="dxa" w:w="1020"/>
+            <w:tcBorders>
+              <w:top w:val="nil"/>
+              <w:bottom w:val="single" w:sz="18" w:color="000000" w:space="0"/>
+              <w:left w:val="nil"/>
+              <w:right w:val="nil"/>
+              <w:insideH w:val="nil"/>
+              <w:insideV w:val="nil"/>
+            </w:tcBorders>
           </w:tcPr>
           <w:p>
             <w:pPr>
               <w:jc w:val="center"/>
             </w:pPr>
-            <w:r/>
             <w:r>
               <w:rPr>
                 <w:rFonts w:ascii="Times New Roman" w:hAnsi="Times New Roman" w:cs="Times New Roman" w:eastAsia="Times New Roman"/>
@@ -1408,12 +1883,19 @@
         <w:tc>
           <w:tcPr>
             <w:tcW w:type="dxa" w:w="964"/>
+            <w:tcBorders>
+              <w:top w:val="nil"/>
+              <w:bottom w:val="single" w:sz="18" w:color="000000" w:space="0"/>
+              <w:left w:val="nil"/>
+              <w:right w:val="nil"/>
+              <w:insideH w:val="nil"/>
+              <w:insideV w:val="nil"/>
+            </w:tcBorders>
           </w:tcPr>
           <w:p>
             <w:pPr>
               <w:jc w:val="center"/>
             </w:pPr>
-            <w:r/>
             <w:r>
               <w:rPr>
                 <w:rFonts w:ascii="Times New Roman" w:hAnsi="Times New Roman" w:cs="Times New Roman" w:eastAsia="Times New Roman"/>
@@ -1428,12 +1910,19 @@
         <w:tc>
           <w:tcPr>
             <w:tcW w:type="dxa" w:w="964"/>
+            <w:tcBorders>
+              <w:top w:val="nil"/>
+              <w:bottom w:val="single" w:sz="18" w:color="000000" w:space="0"/>
+              <w:left w:val="nil"/>
+              <w:right w:val="nil"/>
+              <w:insideH w:val="nil"/>
+              <w:insideV w:val="nil"/>
+            </w:tcBorders>
           </w:tcPr>
           <w:p>
             <w:pPr>
               <w:jc w:val="center"/>
             </w:pPr>
-            <w:r/>
             <w:r>
               <w:rPr>
                 <w:rFonts w:ascii="Times New Roman" w:hAnsi="Times New Roman" w:cs="Times New Roman" w:eastAsia="Times New Roman"/>
@@ -1448,12 +1937,19 @@
         <w:tc>
           <w:tcPr>
             <w:tcW w:type="dxa" w:w="1020"/>
+            <w:tcBorders>
+              <w:top w:val="nil"/>
+              <w:bottom w:val="single" w:sz="18" w:color="000000" w:space="0"/>
+              <w:left w:val="nil"/>
+              <w:right w:val="nil"/>
+              <w:insideH w:val="nil"/>
+              <w:insideV w:val="nil"/>
+            </w:tcBorders>
           </w:tcPr>
           <w:p>
             <w:pPr>
               <w:jc w:val="center"/>
             </w:pPr>
-            <w:r/>
             <w:r>
               <w:rPr>
                 <w:rFonts w:ascii="Times New Roman" w:hAnsi="Times New Roman" w:cs="Times New Roman" w:eastAsia="Times New Roman"/>
@@ -1468,12 +1964,19 @@
         <w:tc>
           <w:tcPr>
             <w:tcW w:type="dxa" w:w="964"/>
+            <w:tcBorders>
+              <w:top w:val="nil"/>
+              <w:bottom w:val="single" w:sz="18" w:color="000000" w:space="0"/>
+              <w:left w:val="nil"/>
+              <w:right w:val="nil"/>
+              <w:insideH w:val="nil"/>
+              <w:insideV w:val="nil"/>
+            </w:tcBorders>
           </w:tcPr>
           <w:p>
             <w:pPr>
               <w:jc w:val="center"/>
             </w:pPr>
-            <w:r/>
             <w:r>
               <w:rPr>
                 <w:rFonts w:ascii="Times New Roman" w:hAnsi="Times New Roman" w:cs="Times New Roman" w:eastAsia="Times New Roman"/>
@@ -1488,12 +1991,19 @@
         <w:tc>
           <w:tcPr>
             <w:tcW w:type="dxa" w:w="1020"/>
+            <w:tcBorders>
+              <w:top w:val="nil"/>
+              <w:bottom w:val="single" w:sz="18" w:color="000000" w:space="0"/>
+              <w:left w:val="nil"/>
+              <w:right w:val="nil"/>
+              <w:insideH w:val="nil"/>
+              <w:insideV w:val="nil"/>
+            </w:tcBorders>
           </w:tcPr>
           <w:p>
             <w:pPr>
               <w:jc w:val="center"/>
             </w:pPr>
-            <w:r/>
             <w:r>
               <w:rPr>
                 <w:rFonts w:ascii="Times New Roman" w:hAnsi="Times New Roman" w:cs="Times New Roman" w:eastAsia="Times New Roman"/>

</xml_diff>